<commit_message>
Redesign figures/tables to JAMA house style; renumber figures; harmonize covariates
- Add shared design system R/_journal_theme.R (JAMA palette, Helvetica, save_fig)
- Add R/07_tables_gt.R: publication tables via gt (PNG + PDF + HTML)
- Rebuild all figures and renumber: methods swim-lane = Figure 1, table-forest =
  Figure 2, PCA = Figure 3, sensitivity = Figure 4
- Export each panel as an individual TIFF under figures/individual/
- Harmonize PCA and MNAR-sensitivity models to the full 7-covariate adjustment
  set (matches the primary analysis); update Supp S1 accordingly
- Figure 3 biplot recoloured blue = size axis / gold = shape axis; Figure 4
  E-value panel simplified to a single 95%-CI-limit E-value with benchmark
- Update FIGURE_LEGENDS, run_all.R, and README to reflect the real workflow
</commit_message>
<xml_diff>
--- a/outputs/tables/TABLES.docx
+++ b/outputs/tables/TABLES.docx
@@ -2365,7 +2365,7 @@
               <w:pStyle w:val="Compact"/>
             </w:pPr>
             <w:r>
-              <w:t xml:space="preserve">1.19 (0.94–1.52), 0.154</w:t>
+              <w:t xml:space="preserve">1.25 (0.94–1.67), 0.124</w:t>
             </w:r>
           </w:p>
         </w:tc>
@@ -2400,7 +2400,7 @@
               <w:pStyle w:val="Compact"/>
             </w:pPr>
             <w:r>
-              <w:t xml:space="preserve">0.97 (0.71–1.33), 0.860</w:t>
+              <w:t xml:space="preserve">0.98 (0.70–1.36), 0.883</w:t>
             </w:r>
           </w:p>
         </w:tc>
@@ -2435,7 +2435,7 @@
               <w:pStyle w:val="Compact"/>
             </w:pPr>
             <w:r>
-              <w:t xml:space="preserve">1.01 (0.70–1.46), 0.956</w:t>
+              <w:t xml:space="preserve">0.95 (0.64–1.43), 0.821</w:t>
             </w:r>
           </w:p>
         </w:tc>
@@ -2470,7 +2470,7 @@
               <w:pStyle w:val="Compact"/>
             </w:pPr>
             <w:r>
-              <w:t xml:space="preserve">1.22 (0.98–1.53), 0.079</w:t>
+              <w:t xml:space="preserve">1.24 (0.98–1.57), 0.067</w:t>
             </w:r>
           </w:p>
         </w:tc>
@@ -2505,7 +2505,7 @@
               <w:pStyle w:val="Compact"/>
             </w:pPr>
             <w:r>
-              <w:t xml:space="preserve">0.88 (0.65–1.18), 0.387</w:t>
+              <w:t xml:space="preserve">0.89 (0.65–1.23), 0.486</w:t>
             </w:r>
           </w:p>
         </w:tc>
@@ -2540,7 +2540,7 @@
               <w:pStyle w:val="Compact"/>
             </w:pPr>
             <w:r>
-              <w:t xml:space="preserve">1.20 (0.84–1.71), 0.325</w:t>
+              <w:t xml:space="preserve">1.14 (0.78–1.66), 0.502</w:t>
             </w:r>
           </w:p>
         </w:tc>
@@ -2575,7 +2575,7 @@
               <w:pStyle w:val="Compact"/>
             </w:pPr>
             <w:r>
-              <w:t xml:space="preserve">1.29 (1.02–1.62), 0.034</w:t>
+              <w:t xml:space="preserve">1.35 (1.06–1.73), 0.017</w:t>
             </w:r>
           </w:p>
         </w:tc>
@@ -2610,7 +2610,7 @@
               <w:pStyle w:val="Compact"/>
             </w:pPr>
             <w:r>
-              <w:t xml:space="preserve">0.87 (0.63–1.19), 0.374</w:t>
+              <w:t xml:space="preserve">0.83 (0.60–1.15), 0.265</w:t>
             </w:r>
           </w:p>
         </w:tc>
@@ -2645,7 +2645,7 @@
               <w:pStyle w:val="Compact"/>
             </w:pPr>
             <w:r>
-              <w:t xml:space="preserve">1.23 (0.85–1.79), 0.270</w:t>
+              <w:t xml:space="preserve">1.13 (0.77–1.67), 0.536</w:t>
             </w:r>
           </w:p>
         </w:tc>
@@ -2680,7 +2680,7 @@
               <w:pStyle w:val="Compact"/>
             </w:pPr>
             <w:r>
-              <w:t xml:space="preserve">β=-0.61, p=0.007</w:t>
+              <w:t xml:space="preserve">β=-0.71, p=0.003</w:t>
             </w:r>
           </w:p>
         </w:tc>

</xml_diff>